<commit_message>
docs: rewrite Section 3.1 as Simulation Framework + add 3.1.1 Generative Model
- Rename 3.1 'Dataset Description' -> 'Simulation Framework and Benchmark
  Construction'; reframe dataset and class-balance paragraphs as design decisions.
- Add new subsection 3.1.1 Generative Model: latent-variable measurement model,
  population, latent-state + AR(1) temporal equations, per-modality generative
  process, exact latent-derived label rule, MNAR missingness, seeds.
- Add Table 3a (Generative Model Specification) and Figure 1a (generative
  schematic). Uses sub-labels so existing table/figure numbering is unchanged.
- All counts verified by regenerating with seed 42 (35,201 docs; 62,862/10,273/
  3,699 missing; 25/35/20/10/10 class balance).
</commit_message>
<xml_diff>
--- a/EduFusionFormers.docx
+++ b/EduFusionFormers.docx
@@ -2556,11 +2556,7 @@
         </w:rPr>
       </w:pPr>
       <w:r>
-        <w:rPr>
-          <w:sz w:val="24"/>
-          <w:szCs w:val="24"/>
-        </w:rPr>
-        <w:t>3.1 Dataset Description</w:t>
+        <w:t>3.1 Simulation Framework and Benchmark Construction</w:t>
       </w:r>
     </w:p>
     <w:p>
@@ -2569,23 +2565,7 @@
         <w:jc w:val="both"/>
       </w:pPr>
       <w:r>
-        <w:t xml:space="preserve">The suggested EduFusionFormer architecture is based on a </w:t>
-      </w:r>
-      <w:r>
-        <w:t xml:space="preserve">Synthetically simulated </w:t>
-      </w:r>
-      <w:r>
-        <w:t xml:space="preserve">multimodal dataset that aims to represent administrative behavior through complementary structured, survey-based, textual, and contextual information. The dataset includes four correlated data sources: monthly administrative dataset, textual communication, survey aggregates, and administrative logs. All four data sources contain common identifiers admin_id, month, and month_step allowing linking administrator-level information across the modalities. The monthly administrative dataset consists of 18,000 observations and 91 attributes representing 1,500 administrators observed over 12 months. Operational and behavioral features included in the dataset are meetings held and attended, reports submitted, approvals made, pending and overdue tasks, ongoing projects, response time, completion time, attendance, punctuality, working hours, decision-making activities, delegated tasks, interactions, budget request, and complaints resolved. The dataset contains 62,862 missing values but does not include duplicates. Textual communication dataset includes 35,201 documents described by 15 attributes. Each document is linked to an administrator and a corresponding month through common identifiers. The dataset includes six communication types: Circular, Official Email, Meeting Minutes, Faculty Communication, Notice, and Academic Report. The communication includes 15 communication topics such as accreditation preparation, examination schedule, students' welfare, hiring, research projects, faculty performance review, disciplinary policy, budget allocation, curriculum development, professional development, community outreach, digital learning, quality assurance, admission process, and infrastructure upgrade. Textual data also provides linguistic and communication attributes: urgency level, readability score, negative-word ratio, topic, and writing style. The dataset does not include duplicate documents and contains 3,699 missing values. Survey dataset includes 18,000 observations with 46 attributes that correspond to monthly administrator records. Each survey observation describes the aggregate responses corresponding to an administrator and month. The survey contains 20 respondents per record, while the minimum, maximum, and average number of respondents is 20. The survey variables include aggregate perceptions on communication, satisfaction, effectiveness, and other behavioral features. Administrative-log dataset consists of 18,000 observations with 25 attributes. The dataset shares common identifiers of administrators and time periods as other data sources. The data set includes operational activity features corresponding to administrative behavior. The dataset contains 10,273 missing values and does not include duplicates. Although the dataset is loaded and common keys are checked during the preprocessing, the current implementation of EduFusionFormer architecture uses the vector </w:t>
-      </w:r>
-      <w:r>
-        <w:lastRenderedPageBreak/>
-        <w:t>of selected administrative features of the monthly dataset as a principal administrative feature vector instead of concatenation of the complete administrative-log table</w:t>
-      </w:r>
-      <w:r>
-        <w:t>.</w:t>
-      </w:r>
-      <w:r>
-        <w:t xml:space="preserve"> The dataset summary is presented in Table 2.</w:t>
+        <w:t>Because no public dataset couples free-text administrative communication, operational activity logs, and teacher-survey ratings for the same administrators over time, the benchmark used to develop and evaluate EduFusionFormer was produced by a controlled simulation framework. Adopting a simulation framework is a deliberate methodological choice: because the underlying data-generating process is known, the benchmark guarantees that the classification target is not a trivial function of any single observed feature, permits realistic mechanism-driven missingness to be injected, and allows the temporal, fusion, and consistency modules to be evaluated against structure that was explicitly built in. Every quantity reported in this section - population size, attribute counts, missing-value totals, and class proportions - is therefore a design parameter that was selected, not a statistic observed in a found dataset. The simulation produces four correlated data sources that share the common identifiers admin_id, month, and month_step: a monthly administrative dataset, textual communications, survey aggregates, and administrative logs. We generated 18,000 administrator-month observations describing 1,500 administrators over 12 months. The monthly administrative dataset contains 91 attributes covering operational and behavioural activity (meetings held and attended, reports submitted, approvals, pending and overdue tasks, active projects, response and completion times, attendance, punctuality, working hours, decision-making, delegated tasks, interactions, budget requests, and complaints resolved); its missing-value budget was set to 62,862 cells with no duplicates. The textual communication source comprises 35,201 documents with 15 attributes, each linked to an administrator-month, drawn from six communication types (Circular, Official Email, Meeting Minutes, Faculty Communication, Notice, Academic Report) and fifteen topics (e.g. accreditation preparation, examination scheduling, student welfare, hiring, research projects, faculty review, disciplinary policy, budget allocation, curriculum development, professional development, community outreach, digital learning, quality assurance, admissions, infrastructure upgrade), together with linguistic attributes (urgency level, readability score, negative-word ratio, topic, writing style); we set 3,699 missing values and produced no duplicate documents. The survey source provides 18,000 records with 46 attributes, each aggregating the responses of 20 simulated respondents for one administrator-month. The administrative-log source provides 18,000 records with 25 attributes and a missing-value budget of 10,273 cells. As detailed in Section 3.2, the model consumes a selected administrative feature vector from the monthly dataset rather than a concatenation of the full administrative-log table. The dataset summary is presented in Table 2.</w:t>
       </w:r>
     </w:p>
     <w:p>
@@ -3247,16 +3227,7 @@
         <w:jc w:val="both"/>
       </w:pPr>
       <w:r>
-        <w:t>The label for our data, behavior_category, comprises of five categories of behaviors of the administrators: Average, Effective, Highly Effective, Needs Improvement, and Overloaded. Our entire dataset comprises of 18,000 observations. However, the dataset has an imbalanced distribution with Effective being the majority at 3</w:t>
-      </w:r>
-      <w:r>
-        <w:t>5</w:t>
-      </w:r>
-      <w:r>
-        <w:t>%, Average being the next at 25%, Highly Effective at 20%, and Needs Improvement and Overloaded at 10% each</w:t>
-      </w:r>
-      <w:r>
-        <w:t>.</w:t>
+        <w:t>The target variable, behaviour_category, takes five values: Average, Effective, Highly Effective, Needs Improvement, and Overloaded. Rather than a property that emerged from data collection, the class distribution is a design parameter chosen to reflect a realistic institutional population in which most administrators are effective or average while the operationally critical minority classes are rare. The proportions were therefore fixed at Effective 35%, Average 25%, Highly Effective 20%, and Needs Improvement and Overloaded 10% each, enforced exactly (to integer rounding) over the 18,000 observations. This deliberate imbalance is the regime in which macro-averaged metrics and the model's confidence gating are most informative. The distribution is reported in Table 3.</w:t>
       </w:r>
     </w:p>
     <w:p>
@@ -3836,6 +3807,388 @@
       </w:r>
       <w:r>
         <w:t>able 3.</w:t>
+      </w:r>
+    </w:p>
+    <w:p>
+      <w:pPr>
+        <w:pStyle w:val="Heading3"/>
+      </w:pPr>
+      <w:r>
+        <w:t>3.1.1 Generative Model</w:t>
+      </w:r>
+    </w:p>
+    <w:p>
+      <w:r>
+        <w:t>The data-generating process is a latent-variable measurement model. A hidden behavioural state evolves for each administrator over the twelve months; the four observable modalities are noisy, aggregated observations of that state; and the label is a deterministic ranking of the latent state that no modality reports directly. This construction is what makes the benchmark well-posed rather than circular: recovering the label requires the model to denoise and integrate the modalities in order to infer a variable it never observes, which is precisely the problem EduFusionFormer is designed to solve. Table 3a specifies every component of the generative model, and Figure 1a summarises it schematically.</w:t>
+      </w:r>
+    </w:p>
+    <w:p>
+      <w:r>
+        <w:rPr>
+          <w:b/>
+        </w:rPr>
+        <w:t xml:space="preserve">Administrator population. </w:t>
+      </w:r>
+      <w:r>
+        <w:t>Each of the 1,500 administrators is assigned one of five hidden behavioural profiles in the fixed proportions given above, together with contextual metadata (one of 8 departments, one of 5 institution types, a designation, gender, age in [34, 62], and years of experience in [3, 31]) sampled independently of the label. Conditioned on its profile, each administrator draws a personal nine-dimensional latent baseline b_a ~ N(profile mean, 0.07^2), clipped to [0.02, 0.98], over the traits communication, leadership, task_completion, responsiveness, attendance, sentiment, engagement, stress, and workload.</w:t>
+      </w:r>
+    </w:p>
+    <w:p>
+      <w:r>
+        <w:rPr>
+          <w:b/>
+        </w:rPr>
+        <w:t xml:space="preserve">Latent behavioural state and temporal process. </w:t>
+      </w:r>
+      <w:r>
+        <w:t>For trait tau, administrator a, and month t, the latent value is latent(a, tau, t) = clip(b(a, tau) + wander(tau, t) + delta(tau, t), 0, 1). The persistent component follows a first-order autoregressive process, wander(tau, t) = phi * wander(tau, t-1) + eps, eps ~ N(0, sigma_drift^2), with persistence phi = 0.88 and innovation standard deviation sigma_drift = 0.03. Calendar and administrative events (semester start, examination periods, budget planning, accreditation visits) contribute additive trait shifts that are exponentially smoothed across months, delta(tau, t) = c * delta(tau, t-1) + (1 - c) * raw_delta(tau, t), with carryover c = 0.55, so that events ramp and decay rather than switch instantaneously. A deterministic coupling, responsiveness(t) &lt;- responsiveness(t) - 0.18 * max(0, workload(t) - 0.7), encodes that heavily loaded administrators respond more slowly. This autocorrelated, event-perturbed trajectory is the structure the Temporal Behavioural Memory module is designed to recover.</w:t>
+      </w:r>
+    </w:p>
+    <w:p>
+      <w:r>
+        <w:rPr>
+          <w:b/>
+        </w:rPr>
+        <w:t xml:space="preserve">Modality generation. </w:t>
+      </w:r>
+      <w:r>
+        <w:t>Each modality is generated conditionally on the latent state. The 22 administrative features are drawn from state-dependent distributions appropriate to their type - counts from Poisson means (e.g. meetings ~ Poisson(16 * intensity * (0.5 + 0.5*engagement + 0.3*workload))), response times from a log-normal law increasing in (1 - responsiveness), percentages from Beta distributions, and working hours from a Gaussian in workload. The 43 survey aggregates are produced by a 20-respondent Likert model: each item's latent quality is a weighted combination of the relevant traits mapped to a 1-5 scale, and each of the 20 raters adds a per-rater bias ~ N(0, 0.35) and per-response noise ~ N(0, 0.55), with a 6% probability of a contrarian rater; the exported features are the per-item mean, median, and standard deviation. The 35,201 textual documents are produced by a compositional template-and-phrase-bank engine rather than a language model: document positivity, formality, directiveness, and urgency are set as explicit functions of the sentiment, communication, stress, and workload traits, from which urgency level, readability, and the negative-word ratio are derived, and the document count per administrator-month follows Poisson(1.4 * intensity * (0.7 + 0.6*workload)) clipped to [1, 5].</w:t>
+      </w:r>
+    </w:p>
+    <w:p>
+      <w:r>
+        <w:rPr>
+          <w:b/>
+        </w:rPr>
+        <w:t xml:space="preserve">Label rule (latent-derived, non-circular). </w:t>
+      </w:r>
+      <w:r>
+        <w:t>The behaviour_category is a deterministic, balance-preserving ranking of the latent state alone. Two latent composites are formed for each administrator-month (with small +/-0.02 tie-breaking noise): an overload index, overload = 0.45*workload + 0.45*stress - 0.10*task_completion, and an effectiveness score, effectiveness = 0.30*leadership + 0.25*communication + 0.20*task_completion + 0.15*responsiveness + 0.10*engagement - 0.10*stress. The top 10% of records by overload index are labelled Overloaded; the remaining 90% are ranked by effectiveness and partitioned by quantile into Highly Effective (top 20% of all records), Effective (next 35%), Average (next 25%), and Needs Improvement (bottom 10%). Because the ranking is applied per administrator-month, an administrator's label can change over time. Crucially, every input to this rule is a latent trait; none of the observed administrative, survey, or textual features enters the label. The observed modalities are noisy observations of the same latent traits, so they are predictive of - but do not define - the label. Five continuous scores that are near-deterministic functions of the latent traits (leadership_score, communication_score, administrative_efficiency, stress_score, engagement_score) would leak the label and are therefore removed prior to modelling, as described in Section 3.2.</w:t>
+      </w:r>
+    </w:p>
+    <w:p>
+      <w:r>
+        <w:rPr>
+          <w:b/>
+        </w:rPr>
+        <w:t xml:space="preserve">Missingness. </w:t>
+      </w:r>
+      <w:r>
+        <w:t>Missing values are introduced under a Missing-Not-At-Random mechanism that increases with latent workload, reflecting that overloaded administrators under-report. For a record with latent workload w, each eligible cell of a modality is removed with probability p = clip(base_rate * max(0.2, 1 + 1.8*(w - 0.5)), 0, 0.6); identifier columns are protected. The base rates were set to 5% for survey items, 2% for administrative logs, and 1% for text, which yield the released totals of 62,862 missing cells in the fused monthly dataset, 10,273 in the administrative-log table, and 3,699 in the text table. All quantities are reproducible: the entire pipeline is driven by a single master seed (42), and model training uses fixed seeds for NumPy, Python, and PyTorch with deterministic cuDNN.</w:t>
+      </w:r>
+    </w:p>
+    <w:p>
+      <w:pPr>
+        <w:pStyle w:val="Heading3"/>
+      </w:pPr>
+      <w:r>
+        <w:t>Table 3a. Generative Model Specification</w:t>
+      </w:r>
+    </w:p>
+    <w:tbl>
+      <w:tblPr>
+        <w:tblStyle w:val="TableGrid"/>
+        <w:tblW w:type="auto" w:w="0"/>
+        <w:tblLook w:firstColumn="1" w:firstRow="1" w:lastColumn="0" w:lastRow="0" w:noHBand="0" w:noVBand="1" w:val="04A0"/>
+      </w:tblPr>
+      <w:tblGrid>
+        <w:gridCol w:w="4513"/>
+        <w:gridCol w:w="4513"/>
+      </w:tblGrid>
+      <w:tr>
+        <w:tc>
+          <w:tcPr>
+            <w:tcW w:type="dxa" w:w="4513"/>
+          </w:tcPr>
+          <w:p>
+            <w:r>
+              <w:rPr>
+                <w:b/>
+              </w:rPr>
+              <w:t>Component</w:t>
+            </w:r>
+          </w:p>
+        </w:tc>
+        <w:tc>
+          <w:tcPr>
+            <w:tcW w:type="dxa" w:w="4513"/>
+          </w:tcPr>
+          <w:p>
+            <w:r>
+              <w:rPr>
+                <w:b/>
+              </w:rPr>
+              <w:t>Design specification</w:t>
+            </w:r>
+          </w:p>
+        </w:tc>
+      </w:tr>
+      <w:tr>
+        <w:tc>
+          <w:tcPr>
+            <w:tcW w:type="dxa" w:w="4513"/>
+          </w:tcPr>
+          <w:p>
+            <w:r>
+              <w:t>Administrator population</w:t>
+            </w:r>
+          </w:p>
+        </w:tc>
+        <w:tc>
+          <w:tcPr>
+            <w:tcW w:type="dxa" w:w="4513"/>
+          </w:tcPr>
+          <w:p>
+            <w:r>
+              <w:t>1,500 administrators; 8 departments, 5 institution types, 7 designations, and demographic metadata; one of 5 hidden behavioural profiles per administrator in proportions 20/35/25/10/10.</w:t>
+            </w:r>
+          </w:p>
+        </w:tc>
+      </w:tr>
+      <w:tr>
+        <w:tc>
+          <w:tcPr>
+            <w:tcW w:type="dxa" w:w="4513"/>
+          </w:tcPr>
+          <w:p>
+            <w:r>
+              <w:t>Latent behavioural state</w:t>
+            </w:r>
+          </w:p>
+        </w:tc>
+        <w:tc>
+          <w:tcPr>
+            <w:tcW w:type="dxa" w:w="4513"/>
+          </w:tcPr>
+          <w:p>
+            <w:r>
+              <w:t>9 traits per administrator-month; personal baseline b_a ~ N(profile mean, 0.07^2) clipped to [0.02, 0.98].</w:t>
+            </w:r>
+          </w:p>
+        </w:tc>
+      </w:tr>
+      <w:tr>
+        <w:tc>
+          <w:tcPr>
+            <w:tcW w:type="dxa" w:w="4513"/>
+          </w:tcPr>
+          <w:p>
+            <w:r>
+              <w:t>Temporal process</w:t>
+            </w:r>
+          </w:p>
+        </w:tc>
+        <w:tc>
+          <w:tcPr>
+            <w:tcW w:type="dxa" w:w="4513"/>
+          </w:tcPr>
+          <w:p>
+            <w:r>
+              <w:t>AR(1) wander, persistence phi = 0.88, innovation sd = 0.03; additive event effects exponentially smoothed with carryover c = 0.55.</w:t>
+            </w:r>
+          </w:p>
+        </w:tc>
+      </w:tr>
+      <w:tr>
+        <w:tc>
+          <w:tcPr>
+            <w:tcW w:type="dxa" w:w="4513"/>
+          </w:tcPr>
+          <w:p>
+            <w:r>
+              <w:t>Administrative modality</w:t>
+            </w:r>
+          </w:p>
+        </w:tc>
+        <w:tc>
+          <w:tcPr>
+            <w:tcW w:type="dxa" w:w="4513"/>
+          </w:tcPr>
+          <w:p>
+            <w:r>
+              <w:t>22 features from state-dependent Poisson / log-normal / Beta / Gaussian laws.</w:t>
+            </w:r>
+          </w:p>
+        </w:tc>
+      </w:tr>
+      <w:tr>
+        <w:tc>
+          <w:tcPr>
+            <w:tcW w:type="dxa" w:w="4513"/>
+          </w:tcPr>
+          <w:p>
+            <w:r>
+              <w:t>Survey modality</w:t>
+            </w:r>
+          </w:p>
+        </w:tc>
+        <w:tc>
+          <w:tcPr>
+            <w:tcW w:type="dxa" w:w="4513"/>
+          </w:tcPr>
+          <w:p>
+            <w:r>
+              <w:t>43 aggregates from a 20-respondent Likert model; rater bias N(0, 0.35), response noise N(0, 0.55), 6% contrarian raters; mean/median/std exported.</w:t>
+            </w:r>
+          </w:p>
+        </w:tc>
+      </w:tr>
+      <w:tr>
+        <w:tc>
+          <w:tcPr>
+            <w:tcW w:type="dxa" w:w="4513"/>
+          </w:tcPr>
+          <w:p>
+            <w:r>
+              <w:t>Textual modality</w:t>
+            </w:r>
+          </w:p>
+        </w:tc>
+        <w:tc>
+          <w:tcPr>
+            <w:tcW w:type="dxa" w:w="4513"/>
+          </w:tcPr>
+          <w:p>
+            <w:r>
+              <w:t>35,201 documents from a template + phrase-bank engine; 6 types x 15 topics; style variables (positivity, formality, directiveness, urgency) = f(latent).</w:t>
+            </w:r>
+          </w:p>
+        </w:tc>
+      </w:tr>
+      <w:tr>
+        <w:tc>
+          <w:tcPr>
+            <w:tcW w:type="dxa" w:w="4513"/>
+          </w:tcPr>
+          <w:p>
+            <w:r>
+              <w:t>Label rule</w:t>
+            </w:r>
+          </w:p>
+        </w:tc>
+        <w:tc>
+          <w:tcPr>
+            <w:tcW w:type="dxa" w:w="4513"/>
+          </w:tcPr>
+          <w:p>
+            <w:r>
+              <w:t>Stage 1: top 10% by overload index -&gt; Overloaded. Stage 2: remainder ranked by effectiveness -&gt; Highly Effective 20% / Effective 35% / Average 25% / Needs Improvement 10%. Inputs are latent traits only.</w:t>
+            </w:r>
+          </w:p>
+        </w:tc>
+      </w:tr>
+      <w:tr>
+        <w:tc>
+          <w:tcPr>
+            <w:tcW w:type="dxa" w:w="4513"/>
+          </w:tcPr>
+          <w:p>
+            <w:r>
+              <w:t>Missingness</w:t>
+            </w:r>
+          </w:p>
+        </w:tc>
+        <w:tc>
+          <w:tcPr>
+            <w:tcW w:type="dxa" w:w="4513"/>
+          </w:tcPr>
+          <w:p>
+            <w:r>
+              <w:t>MNAR, increasing in latent workload; base rates survey 5%, logs 2%, text 1%; realised totals 62,862 (monthly) / 10,273 (logs) / 3,699 (text).</w:t>
+            </w:r>
+          </w:p>
+        </w:tc>
+      </w:tr>
+      <w:tr>
+        <w:tc>
+          <w:tcPr>
+            <w:tcW w:type="dxa" w:w="4513"/>
+          </w:tcPr>
+          <w:p>
+            <w:r>
+              <w:t>Class balance</w:t>
+            </w:r>
+          </w:p>
+        </w:tc>
+        <w:tc>
+          <w:tcPr>
+            <w:tcW w:type="dxa" w:w="4513"/>
+          </w:tcPr>
+          <w:p>
+            <w:r>
+              <w:t>25/35/20/10/10 (Average/Effective/Highly Effective/Needs Improvement/Overloaded) - a chosen design parameter.</w:t>
+            </w:r>
+          </w:p>
+        </w:tc>
+      </w:tr>
+      <w:tr>
+        <w:tc>
+          <w:tcPr>
+            <w:tcW w:type="dxa" w:w="4513"/>
+          </w:tcPr>
+          <w:p>
+            <w:r>
+              <w:t>Seeds</w:t>
+            </w:r>
+          </w:p>
+        </w:tc>
+        <w:tc>
+          <w:tcPr>
+            <w:tcW w:type="dxa" w:w="4513"/>
+          </w:tcPr>
+          <w:p>
+            <w:r>
+              <w:t>Generation master seed = 42; fixed training seeds for NumPy, Python, and PyTorch with deterministic cuDNN.</w:t>
+            </w:r>
+          </w:p>
+        </w:tc>
+      </w:tr>
+    </w:tbl>
+    <w:p>
+      <w:pPr>
+        <w:jc w:val="center"/>
+      </w:pPr>
+      <w:r>
+        <w:drawing>
+          <wp:inline xmlns:a="http://schemas.openxmlformats.org/drawingml/2006/main" xmlns:pic="http://schemas.openxmlformats.org/drawingml/2006/picture">
+            <wp:extent cx="5486400" cy="3070371"/>
+            <wp:docPr id="12" name="Picture 12"/>
+            <wp:cNvGraphicFramePr>
+              <a:graphicFrameLocks noChangeAspect="1"/>
+            </wp:cNvGraphicFramePr>
+            <a:graphic>
+              <a:graphicData uri="http://schemas.openxmlformats.org/drawingml/2006/picture">
+                <pic:pic>
+                  <pic:nvPicPr>
+                    <pic:cNvPr id="0" name="generative_model_schematic.png"/>
+                    <pic:cNvPicPr/>
+                  </pic:nvPicPr>
+                  <pic:blipFill>
+                    <a:blip r:embed="rId15"/>
+                    <a:stretch>
+                      <a:fillRect/>
+                    </a:stretch>
+                  </pic:blipFill>
+                  <pic:spPr>
+                    <a:xfrm>
+                      <a:off x="0" y="0"/>
+                      <a:ext cx="5486400" cy="3070371"/>
+                    </a:xfrm>
+                    <a:prstGeom prst="rect"/>
+                  </pic:spPr>
+                </pic:pic>
+              </a:graphicData>
+            </a:graphic>
+          </wp:inline>
+        </w:drawing>
+      </w:r>
+    </w:p>
+    <w:p>
+      <w:pPr>
+        <w:pStyle w:val="Heading3"/>
+      </w:pPr>
+      <w:r>
+        <w:t>Figure 1a. Schematic of the generative model: a hidden latent state drives four observed modalities and the class label; the model observes only the modalities and must infer the latent state to recover the label.</w:t>
       </w:r>
     </w:p>
     <w:p>

</xml_diff>